<commit_message>
docs: update report with 101-unit test milestone
- Changed "No unit tests" → "101 unit tests" in backlog table
- Rebuilt AgeCareAI_Full_Report.docx

Co-Authored-By: Claude Opus 4.7 <noreply@anthropic.com>
</commit_message>
<xml_diff>
--- a/workspaces/AgeCareAI/AgeCareAI_Full_Report.docx
+++ b/workspaces/AgeCareAI/AgeCareAI_Full_Report.docx
@@ -5429,7 +5429,7 @@
                 <w:color w:val="2D2D2D"/>
                 <w:sz w:val="18"/>
               </w:rPr>
-              <w:t>No unit tests</w:t>
+              <w:t>101 unit tests</w:t>
             </w:r>
           </w:p>
         </w:tc>
@@ -5463,59 +5463,11 @@
             </w:pPr>
             <w:r>
               <w:rPr>
-                <w:rFonts w:ascii="Courier New" w:hAnsi="Courier New"/>
-                <w:color w:val="C7254E"/>
-                <w:sz w:val="17"/>
-              </w:rPr>
-              <w:t>pytest</w:t>
-            </w:r>
-            <w:r>
-              <w:rPr>
                 <w:b w:val="0"/>
                 <w:color w:val="2D2D2D"/>
                 <w:sz w:val="18"/>
               </w:rPr>
-              <w:t xml:space="preserve"> suite covering </w:t>
-            </w:r>
-            <w:r>
-              <w:rPr>
-                <w:rFonts w:ascii="Courier New" w:hAnsi="Courier New"/>
-                <w:color w:val="C7254E"/>
-                <w:sz w:val="17"/>
-              </w:rPr>
-              <w:t>solve_schedule()</w:t>
-            </w:r>
-            <w:r>
-              <w:rPr>
-                <w:b w:val="0"/>
-                <w:color w:val="2D2D2D"/>
-                <w:sz w:val="18"/>
-              </w:rPr>
-              <w:t xml:space="preserve">, </w:t>
-            </w:r>
-            <w:r>
-              <w:rPr>
-                <w:rFonts w:ascii="Courier New" w:hAnsi="Courier New"/>
-                <w:color w:val="C7254E"/>
-                <w:sz w:val="17"/>
-              </w:rPr>
-              <w:t>decide_actions()</w:t>
-            </w:r>
-            <w:r>
-              <w:rPr>
-                <w:b w:val="0"/>
-                <w:color w:val="2D2D2D"/>
-                <w:sz w:val="18"/>
-              </w:rPr>
-              <w:t xml:space="preserve">, </w:t>
-            </w:r>
-            <w:r>
-              <w:rPr>
-                <w:rFonts w:ascii="Courier New" w:hAnsi="Courier New"/>
-                <w:color w:val="C7254E"/>
-                <w:sz w:val="17"/>
-              </w:rPr>
-              <w:t>extract_features()</w:t>
+              <w:t>Full pytest suite: data models, ML (L1/L2), scheduler (L3), care agent (L4), report gen</w:t>
             </w:r>
           </w:p>
         </w:tc>

</xml_diff>